<commit_message>
Resume: Capital Markets Risk & Compliance Analyst @ Unknown (unknown)
</commit_message>
<xml_diff>
--- a/resumes/Resume_Capital_Markets_Risk___Compliance_A_Unknown__unknown_.docx
+++ b/resumes/Resume_Capital_Markets_Risk___Compliance_A_Unknown__unknown_.docx
@@ -430,7 +430,7 @@
           <w:sz w:val="19"/>
           <w:szCs w:val="19"/>
         </w:rPr>
-        <w:t>Triaged 50+ weekly cases by severity and policy eligibility, ensuring compliance monitoring and risk compliance capital metrics.</w:t>
+        <w:t>Triaged 50+ weekly inventory reimbursement cases by severity and policy eligibility, translating high-volume case review into control evidence, compliance tracking, and decision trails.</w:t>
       </w:r>
     </w:p>
     <w:p>
@@ -449,7 +449,7 @@
           <w:sz w:val="19"/>
           <w:szCs w:val="19"/>
         </w:rPr>
-        <w:t>Investigated seller claims, identifying policy violations and anomalous patterns, and escalated findings to senior reviewers for risk compliance india.</w:t>
+        <w:t>Investigated seller claims, identifying policy violations and anomalous patterns, escalating findings to senior reviewers for risk compliance.</w:t>
       </w:r>
     </w:p>
     <w:p>
@@ -468,7 +468,7 @@
           <w:sz w:val="19"/>
           <w:szCs w:val="19"/>
         </w:rPr>
-        <w:t>Maintained audit-ready case documentation, recording investigation findings and evidence notes for compliance capital markets.</w:t>
+        <w:t>Maintained audit-ready documentation, recording investigation findings and evidence notes for capital markets risk compliance.</w:t>
       </w:r>
     </w:p>
     <w:p>
@@ -487,7 +487,7 @@
           <w:sz w:val="19"/>
           <w:szCs w:val="19"/>
         </w:rPr>
-        <w:t>Spotted recurring fraud patterns across 200+ weekly cases, reducing repeat-issue investigation time for markets risk compliance.</w:t>
+        <w:t>Detected recurring fraud patterns across 200+ weekly cases, reducing repeat-issue investigation time for risk compliance capital.</w:t>
       </w:r>
     </w:p>
     <w:p>
@@ -588,7 +588,7 @@
           <w:sz w:val="19"/>
           <w:szCs w:val="19"/>
         </w:rPr>
-        <w:t>Created audit trails with decision notes and corrective actions for compliance monitoring (regulatory compliance) in capital markets risk compliance, resulting in comprehensive documentation.</w:t>
+        <w:t>Created audit trails with decision trails and documentation completeness for compliance monitoring (regulatory compliance) in capital markets risk compliance, resulting in comprehensive control evidence.</w:t>
       </w:r>
     </w:p>
     <w:p>
@@ -607,7 +607,7 @@
           <w:sz w:val="19"/>
           <w:szCs w:val="19"/>
         </w:rPr>
-        <w:t>Developed control evidence and compliance tracking for risk compliance capital, with a focus on markets risk compliance and regedge capital markets, leading to detailed control gap analysis.</w:t>
+        <w:t>Developed control mapping and compliance documentation for risk compliance capital markets, utilizing Splunk SIEM and network traffic analysis with Wireshark for packet evidence and IDS alert correlation.</w:t>
       </w:r>
     </w:p>
     <w:p>
@@ -626,7 +626,7 @@
           <w:sz w:val="19"/>
           <w:szCs w:val="19"/>
         </w:rPr>
-        <w:t>Built a detection pipeline using Splunk SIEM and MITRE ATT&amp;CK (TTP mapping) mapping for anomaly detection at scale, with a focus on pattern recognition and early escalation in risk compliance india.</w:t>
+        <w:t>Detected anomalies at scale using Splunk correlation searches and MITRE ATT&amp;CK (TTP mapping) mapping, identifying patterns and flagging repeat issues for early escalation in risk compliance RegEdge.</w:t>
       </w:r>
     </w:p>
     <w:p>
@@ -697,7 +697,7 @@
           <w:sz w:val="19"/>
           <w:szCs w:val="19"/>
         </w:rPr>
-        <w:t>Generated audit-ready CVE reports for compliance capital markets, with CVSS severity (vulnerability prioritisation) classification and EPSS context from the FIRST.org API, supporting risk identification and control gap analysis.</w:t>
+        <w:t>Built automated vulnerability assessment pipelines for compliance tracking and risk compliance in capital markets, generating audit-ready CVE reports with CVSS severity (vulnerability prioritisation) classification.</w:t>
       </w:r>
     </w:p>
     <w:p>
@@ -716,7 +716,7 @@
           <w:sz w:val="19"/>
           <w:szCs w:val="19"/>
         </w:rPr>
-        <w:t>Developed automated compliance scan scheduling and delta-scan logic to track remediation progress, with a focus on policy-based risk triage and escalation priorities in risk compliance regedge.</w:t>
+        <w:t>Performed control gap analysis and policy-based risk triage, developing compliance scan scheduling and delta-scan logic for remediation progress tracking and audit evidence organization.</w:t>
       </w:r>
     </w:p>
     <w:p>
@@ -735,7 +735,7 @@
           <w:sz w:val="19"/>
           <w:szCs w:val="19"/>
         </w:rPr>
-        <w:t>Created vulnerability-to-remediation audit trails, including SQL injection evidence and parameterised query fixes, for compliance monitoring (regulatory compliance) and risk compliance capital in regedge capital markets.</w:t>
+        <w:t>Created anomaly detection workflows using Nessus and OpenVAS APIs, identifying risk identification and escalation priorities for compliance capital markets and risk compliance India.</w:t>
       </w:r>
     </w:p>
     <w:p>

</xml_diff>